<commit_message>
clean folder and add session4
clean folder and add session4
</commit_message>
<xml_diff>
--- a/2026Teaching/Tutorial 3 - Signals, Transmission - SOLUTIONS.docx
+++ b/2026Teaching/Tutorial 3 - Signals, Transmission - SOLUTIONS.docx
@@ -1,6 +1,6 @@
 
 <file path=word/document.xml><?xml version="1.0" encoding="utf-8"?>
-<w:document xmlns:wpc="http://schemas.microsoft.com/office/word/2010/wordprocessingCanvas" xmlns:cx="http://schemas.microsoft.com/office/drawing/2014/chartex" xmlns:cx1="http://schemas.microsoft.com/office/drawing/2015/9/8/chartex" xmlns:cx2="http://schemas.microsoft.com/office/drawing/2015/10/21/chartex" xmlns:cx3="http://schemas.microsoft.com/office/drawing/2016/5/9/chartex" xmlns:cx4="http://schemas.microsoft.com/office/drawing/2016/5/10/chartex" xmlns:cx5="http://schemas.microsoft.com/office/drawing/2016/5/11/chartex" xmlns:cx6="http://schemas.microsoft.com/office/drawing/2016/5/12/chartex" xmlns:cx7="http://schemas.microsoft.com/office/drawing/2016/5/13/chartex" xmlns:cx8="http://schemas.microsoft.com/office/drawing/2016/5/14/chartex" xmlns:mc="http://schemas.openxmlformats.org/markup-compatibility/2006" xmlns:aink="http://schemas.microsoft.com/office/drawing/2016/ink" xmlns:am3d="http://schemas.microsoft.com/office/drawing/2017/model3d" xmlns:o="urn:schemas-microsoft-com:office:office" xmlns:oel="http://schemas.microsoft.com/office/2019/extlst" xmlns:r="http://schemas.openxmlformats.org/officeDocument/2006/relationships" xmlns:m="http://schemas.openxmlformats.org/officeDocument/2006/math" xmlns:v="urn:schemas-microsoft-com:vml" xmlns:wp14="http://schemas.microsoft.com/office/word/2010/wordprocessingDrawing" xmlns:wp="http://schemas.openxmlformats.org/drawingml/2006/wordprocessingDrawing" xmlns:w10="urn:schemas-microsoft-com:office:word" xmlns:w="http://schemas.openxmlformats.org/wordprocessingml/2006/main" xmlns:w14="http://schemas.microsoft.com/office/word/2010/wordml" xmlns:w15="http://schemas.microsoft.com/office/word/2012/wordml" xmlns:w16cex="http://schemas.microsoft.com/office/word/2018/wordml/cex" xmlns:w16cid="http://schemas.microsoft.com/office/word/2016/wordml/cid" xmlns:w16="http://schemas.microsoft.com/office/word/2018/wordml" xmlns:w16du="http://schemas.microsoft.com/office/word/2023/wordml/word16du" xmlns:w16sdtdh="http://schemas.microsoft.com/office/word/2020/wordml/sdtdatahash" xmlns:w16se="http://schemas.microsoft.com/office/word/2015/wordml/symex" xmlns:wpg="http://schemas.microsoft.com/office/word/2010/wordprocessingGroup" xmlns:wpi="http://schemas.microsoft.com/office/word/2010/wordprocessingInk" xmlns:wne="http://schemas.microsoft.com/office/word/2006/wordml" xmlns:wps="http://schemas.microsoft.com/office/word/2010/wordprocessingShape" mc:Ignorable="w14 w15 w16se w16cid w16 w16cex w16sdtdh wp14">
+<w:document xmlns:wpc="http://schemas.microsoft.com/office/word/2010/wordprocessingCanvas" xmlns:cx="http://schemas.microsoft.com/office/drawing/2014/chartex" xmlns:cx1="http://schemas.microsoft.com/office/drawing/2015/9/8/chartex" xmlns:cx2="http://schemas.microsoft.com/office/drawing/2015/10/21/chartex" xmlns:cx3="http://schemas.microsoft.com/office/drawing/2016/5/9/chartex" xmlns:cx4="http://schemas.microsoft.com/office/drawing/2016/5/10/chartex" xmlns:cx5="http://schemas.microsoft.com/office/drawing/2016/5/11/chartex" xmlns:cx6="http://schemas.microsoft.com/office/drawing/2016/5/12/chartex" xmlns:cx7="http://schemas.microsoft.com/office/drawing/2016/5/13/chartex" xmlns:cx8="http://schemas.microsoft.com/office/drawing/2016/5/14/chartex" xmlns:mc="http://schemas.openxmlformats.org/markup-compatibility/2006" xmlns:aink="http://schemas.microsoft.com/office/drawing/2016/ink" xmlns:am3d="http://schemas.microsoft.com/office/drawing/2017/model3d" xmlns:o="urn:schemas-microsoft-com:office:office" xmlns:oel="http://schemas.microsoft.com/office/2019/extlst" xmlns:r="http://schemas.openxmlformats.org/officeDocument/2006/relationships" xmlns:m="http://schemas.openxmlformats.org/officeDocument/2006/math" xmlns:v="urn:schemas-microsoft-com:vml" xmlns:wp14="http://schemas.microsoft.com/office/word/2010/wordprocessingDrawing" xmlns:wp="http://schemas.openxmlformats.org/drawingml/2006/wordprocessingDrawing" xmlns:w10="urn:schemas-microsoft-com:office:word" xmlns:w="http://schemas.openxmlformats.org/wordprocessingml/2006/main" xmlns:w14="http://schemas.microsoft.com/office/word/2010/wordml" xmlns:w15="http://schemas.microsoft.com/office/word/2012/wordml" xmlns:w16cex="http://schemas.microsoft.com/office/word/2018/wordml/cex" xmlns:w16cid="http://schemas.microsoft.com/office/word/2016/wordml/cid" xmlns:w16="http://schemas.microsoft.com/office/word/2018/wordml" xmlns:w16du="http://schemas.microsoft.com/office/word/2023/wordml/word16du" xmlns:w16sdtdh="http://schemas.microsoft.com/office/word/2020/wordml/sdtdatahash" xmlns:w16sdtfl="http://schemas.microsoft.com/office/word/2024/wordml/sdtformatlock" xmlns:w16se="http://schemas.microsoft.com/office/word/2015/wordml/symex" xmlns:wpg="http://schemas.microsoft.com/office/word/2010/wordprocessingGroup" xmlns:wpi="http://schemas.microsoft.com/office/word/2010/wordprocessingInk" xmlns:wne="http://schemas.microsoft.com/office/word/2006/wordml" xmlns:wps="http://schemas.microsoft.com/office/word/2010/wordprocessingShape" mc:Ignorable="w14 w15 w16se w16cid w16 w16cex w16sdtdh w16sdtfl w16du wp14">
   <w:body>
     <w:p>
       <w:pPr>
@@ -97,16 +97,8 @@
         <w:rPr>
           <w:color w:val="FF0000"/>
         </w:rPr>
-        <w:t xml:space="preserve">Shot </w:t>
-      </w:r>
-      <w:proofErr w:type="gramStart"/>
-      <w:r>
-        <w:rPr>
-          <w:color w:val="FF0000"/>
-        </w:rPr>
-        <w:t>noise</w:t>
-      </w:r>
-      <w:proofErr w:type="gramEnd"/>
+        <w:t>Shot noise</w:t>
+      </w:r>
     </w:p>
     <w:p>
       <w:pPr>
@@ -123,19 +115,7 @@
         <w:rPr>
           <w:color w:val="FF0000"/>
         </w:rPr>
-        <w:t>Thermal noise (</w:t>
-      </w:r>
-      <w:r>
-        <w:rPr>
-          <w:color w:val="FF0000"/>
-        </w:rPr>
-        <w:t xml:space="preserve">Johnson–Nyquist </w:t>
-      </w:r>
-      <w:r>
-        <w:rPr>
-          <w:color w:val="FF0000"/>
-        </w:rPr>
-        <w:t>noise)</w:t>
+        <w:t>Thermal noise (Johnson–Nyquist noise)</w:t>
       </w:r>
     </w:p>
     <w:p>
@@ -227,21 +207,7 @@
         <w:rPr>
           <w:color w:val="FF0000"/>
         </w:rPr>
-        <w:t xml:space="preserve">contact </w:t>
-      </w:r>
-      <w:proofErr w:type="gramStart"/>
-      <w:r>
-        <w:rPr>
-          <w:color w:val="FF0000"/>
-        </w:rPr>
-        <w:t>noise</w:t>
-      </w:r>
-      <w:proofErr w:type="gramEnd"/>
-      <w:r>
-        <w:rPr>
-          <w:color w:val="FF0000"/>
-        </w:rPr>
-        <w:t xml:space="preserve"> </w:t>
+        <w:t xml:space="preserve">contact noise </w:t>
       </w:r>
     </w:p>
     <w:p>
@@ -340,116 +306,88 @@
         <w:rPr>
           <w:color w:val="FF0000"/>
         </w:rPr>
-        <w:t>(</w:t>
+        <w:t>(i.e. includes amplifying gain circuits) introduce noise</w:t>
+      </w:r>
+      <w:r>
+        <w:rPr>
+          <w:color w:val="FF0000"/>
+        </w:rPr>
+        <w:t xml:space="preserve"> from the semiconductors involved in the sensor control circuits.  Each photo-site (sub-pixel in the sensor) </w:t>
+      </w:r>
+      <w:r>
+        <w:rPr>
+          <w:color w:val="FF0000"/>
+        </w:rPr>
+        <w:t xml:space="preserve">requires this control to measure the charge induced during the exposure; </w:t>
+      </w:r>
+      <w:r>
+        <w:rPr>
+          <w:color w:val="FF0000"/>
+        </w:rPr>
+        <w:t xml:space="preserve">then </w:t>
+      </w:r>
+      <w:r>
+        <w:rPr>
+          <w:color w:val="FF0000"/>
+        </w:rPr>
+        <w:t xml:space="preserve">to record the </w:t>
+      </w:r>
+      <w:r>
+        <w:rPr>
+          <w:color w:val="FF0000"/>
+        </w:rPr>
+        <w:t xml:space="preserve">result in the rom/column matrix; apply any </w:t>
+      </w:r>
+      <w:r>
+        <w:rPr>
+          <w:color w:val="FF0000"/>
+        </w:rPr>
+        <w:t xml:space="preserve">processing (exposure gain, colour balance, etc). </w:t>
+      </w:r>
+    </w:p>
+    <w:p>
+      <w:pPr>
+        <w:rPr>
+          <w:color w:val="FF0000"/>
+        </w:rPr>
+      </w:pPr>
+      <w:r>
+        <w:rPr>
+          <w:color w:val="FF0000"/>
+        </w:rPr>
+        <w:t xml:space="preserve">The sensor </w:t>
+      </w:r>
+      <w:r>
+        <w:rPr>
+          <w:color w:val="FF0000"/>
+        </w:rPr>
+        <w:t>is compromised by the small space available, so electronics may interfere across the sensor (i.e. from one photo-site to the next, etc).</w:t>
+      </w:r>
+    </w:p>
+    <w:p>
+      <w:pPr>
+        <w:rPr>
+          <w:color w:val="FF0000"/>
+        </w:rPr>
+      </w:pPr>
+      <w:r>
+        <w:rPr>
+          <w:color w:val="FF0000"/>
+        </w:rPr>
+        <w:t xml:space="preserve">Each site has a capacity to record the charge. The more noise in the system will use more of this capacity. </w:t>
       </w:r>
       <w:proofErr w:type="gramStart"/>
       <w:r>
         <w:rPr>
           <w:color w:val="FF0000"/>
         </w:rPr>
-        <w:t>i.e.</w:t>
+        <w:t>So</w:t>
       </w:r>
       <w:proofErr w:type="gramEnd"/>
       <w:r>
         <w:rPr>
           <w:color w:val="FF0000"/>
         </w:rPr>
-        <w:t xml:space="preserve"> includes amplifying gain circuits) introduce noise</w:t>
-      </w:r>
-      <w:r>
-        <w:rPr>
-          <w:color w:val="FF0000"/>
-        </w:rPr>
-        <w:t xml:space="preserve"> from the semiconductors involved in the sensor control circuits.  Each photo-site (sub-pixel in the sensor) </w:t>
-      </w:r>
-      <w:r>
-        <w:rPr>
-          <w:color w:val="FF0000"/>
-        </w:rPr>
-        <w:t xml:space="preserve">requires this control to measure the charge induced during the exposure; </w:t>
-      </w:r>
-      <w:r>
-        <w:rPr>
-          <w:color w:val="FF0000"/>
-        </w:rPr>
-        <w:t xml:space="preserve">then </w:t>
-      </w:r>
-      <w:r>
-        <w:rPr>
-          <w:color w:val="FF0000"/>
-        </w:rPr>
-        <w:t xml:space="preserve">to record the </w:t>
-      </w:r>
-      <w:r>
-        <w:rPr>
-          <w:color w:val="FF0000"/>
-        </w:rPr>
-        <w:t xml:space="preserve">result in the rom/column matrix; apply any </w:t>
-      </w:r>
-      <w:r>
-        <w:rPr>
-          <w:color w:val="FF0000"/>
-        </w:rPr>
-        <w:t xml:space="preserve">processing (exposure gain, colour balance, etc). </w:t>
-      </w:r>
-    </w:p>
-    <w:p>
-      <w:pPr>
-        <w:rPr>
-          <w:color w:val="FF0000"/>
-        </w:rPr>
-      </w:pPr>
-      <w:r>
-        <w:rPr>
-          <w:color w:val="FF0000"/>
-        </w:rPr>
-        <w:t xml:space="preserve">The sensor </w:t>
-      </w:r>
-      <w:r>
-        <w:rPr>
-          <w:color w:val="FF0000"/>
-        </w:rPr>
-        <w:t>is compromised by the small space available, so electronics may interfere across the sensor (</w:t>
-      </w:r>
-      <w:proofErr w:type="gramStart"/>
-      <w:r>
-        <w:rPr>
-          <w:color w:val="FF0000"/>
-        </w:rPr>
-        <w:t>i.e.</w:t>
-      </w:r>
-      <w:proofErr w:type="gramEnd"/>
-      <w:r>
-        <w:rPr>
-          <w:color w:val="FF0000"/>
-        </w:rPr>
-        <w:t xml:space="preserve"> from one photo-site to the next, etc).</w:t>
-      </w:r>
-    </w:p>
-    <w:p>
-      <w:pPr>
-        <w:rPr>
-          <w:color w:val="FF0000"/>
-        </w:rPr>
-      </w:pPr>
-      <w:r>
-        <w:rPr>
-          <w:color w:val="FF0000"/>
-        </w:rPr>
-        <w:t xml:space="preserve">Each site has a capacity to record the charge. The more noise in the system will use more of this capacity. </w:t>
-      </w:r>
-      <w:proofErr w:type="gramStart"/>
-      <w:r>
-        <w:rPr>
-          <w:color w:val="FF0000"/>
-        </w:rPr>
-        <w:t>So</w:t>
-      </w:r>
-      <w:proofErr w:type="gramEnd"/>
-      <w:r>
-        <w:rPr>
-          <w:color w:val="FF0000"/>
-        </w:rPr>
         <w:t xml:space="preserve"> noise will result in variations of charge</w:t>
       </w:r>
       <w:r>
@@ -468,21 +406,7 @@
         <w:rPr>
           <w:color w:val="FF0000"/>
         </w:rPr>
-        <w:t xml:space="preserve">is more prominent in the lower charge pixels, </w:t>
-      </w:r>
-      <w:proofErr w:type="gramStart"/>
-      <w:r>
-        <w:rPr>
-          <w:color w:val="FF0000"/>
-        </w:rPr>
-        <w:t>i.e.</w:t>
-      </w:r>
-      <w:proofErr w:type="gramEnd"/>
-      <w:r>
-        <w:rPr>
-          <w:color w:val="FF0000"/>
-        </w:rPr>
-        <w:t xml:space="preserve"> the darker pixels. </w:t>
+        <w:t xml:space="preserve">is more prominent in the lower charge pixels, i.e. the darker pixels. </w:t>
       </w:r>
       <w:r>
         <w:rPr>
@@ -742,72 +666,58 @@
         <w:rPr>
           <w:color w:val="FF0000"/>
         </w:rPr>
-        <w:t>lve the frequencies (</w:t>
-      </w:r>
+        <w:t xml:space="preserve">lve the frequencies (i.e. the highest frequency) in the sampled audio. </w:t>
+      </w:r>
+    </w:p>
+    <w:p>
+      <w:pPr>
+        <w:rPr>
+          <w:color w:val="FF0000"/>
+        </w:rPr>
+      </w:pPr>
+      <w:r>
+        <w:rPr>
+          <w:color w:val="FF0000"/>
+        </w:rPr>
+        <w:t>At the highest frequency the signal nee</w:t>
+      </w:r>
+      <w:r>
+        <w:rPr>
+          <w:color w:val="FF0000"/>
+        </w:rPr>
+        <w:t>d</w:t>
+      </w:r>
+      <w:r>
+        <w:rPr>
+          <w:color w:val="FF0000"/>
+        </w:rPr>
+        <w:t xml:space="preserve">s to be sampled at least twice per period to </w:t>
+      </w:r>
+      <w:r>
+        <w:rPr>
+          <w:color w:val="FF0000"/>
+        </w:rPr>
+        <w:t xml:space="preserve">sufficiently record that frequency. </w:t>
+      </w:r>
+    </w:p>
+    <w:p>
+      <w:pPr>
+        <w:rPr>
+          <w:color w:val="FF0000"/>
+        </w:rPr>
+      </w:pPr>
       <w:proofErr w:type="gramStart"/>
       <w:r>
         <w:rPr>
           <w:color w:val="FF0000"/>
         </w:rPr>
-        <w:t>i.e.</w:t>
+        <w:t>So</w:t>
       </w:r>
       <w:proofErr w:type="gramEnd"/>
       <w:r>
         <w:rPr>
           <w:color w:val="FF0000"/>
         </w:rPr>
-        <w:t xml:space="preserve"> the highest frequency) in the sampled audio. </w:t>
-      </w:r>
-    </w:p>
-    <w:p>
-      <w:pPr>
-        <w:rPr>
-          <w:color w:val="FF0000"/>
-        </w:rPr>
-      </w:pPr>
-      <w:r>
-        <w:rPr>
-          <w:color w:val="FF0000"/>
-        </w:rPr>
-        <w:t>At the highest frequency the signal nee</w:t>
-      </w:r>
-      <w:r>
-        <w:rPr>
-          <w:color w:val="FF0000"/>
-        </w:rPr>
-        <w:t>d</w:t>
-      </w:r>
-      <w:r>
-        <w:rPr>
-          <w:color w:val="FF0000"/>
-        </w:rPr>
-        <w:t xml:space="preserve">s to be sampled at least twice per period to </w:t>
-      </w:r>
-      <w:r>
-        <w:rPr>
-          <w:color w:val="FF0000"/>
-        </w:rPr>
-        <w:t xml:space="preserve">sufficiently record that frequency. </w:t>
-      </w:r>
-    </w:p>
-    <w:p>
-      <w:pPr>
-        <w:rPr>
-          <w:color w:val="FF0000"/>
-        </w:rPr>
-      </w:pPr>
-      <w:proofErr w:type="gramStart"/>
-      <w:r>
-        <w:rPr>
-          <w:color w:val="FF0000"/>
-        </w:rPr>
-        <w:t>So</w:t>
-      </w:r>
-      <w:proofErr w:type="gramEnd"/>
-      <w:r>
-        <w:rPr>
-          <w:color w:val="FF0000"/>
-        </w:rPr>
         <w:t xml:space="preserve"> the Nyquist Theo</w:t>
       </w:r>
       <w:r>
@@ -908,6 +818,13 @@
         </w:rPr>
         <w:t xml:space="preserve">. </w:t>
       </w:r>
+    </w:p>
+    <w:p>
+      <w:pPr>
+        <w:rPr>
+          <w:noProof/>
+        </w:rPr>
+      </w:pPr>
     </w:p>
     <w:p>
       <w:r>
@@ -1048,15 +965,7 @@
     </w:p>
     <w:p>
       <w:r>
-        <w:t>The main transmission media for conveying signals is cable, radio/</w:t>
-      </w:r>
-      <w:proofErr w:type="gramStart"/>
-      <w:r>
-        <w:t>satellite</w:t>
-      </w:r>
-      <w:proofErr w:type="gramEnd"/>
-      <w:r>
-        <w:t xml:space="preserve"> and optical fibre. For each of these media, consider the relative advantages and disadvantages of the media, the transmission issues that can cause signal errors, and what can be done to overcome these issues.</w:t>
+        <w:t>The main transmission media for conveying signals is cable, radio/satellite and optical fibre. For each of these media, consider the relative advantages and disadvantages of the media, the transmission issues that can cause signal errors, and what can be done to overcome these issues.</w:t>
       </w:r>
     </w:p>
     <w:p/>
@@ -1185,16 +1094,8 @@
         <w:rPr>
           <w:color w:val="FF0000"/>
         </w:rPr>
-        <w:t xml:space="preserve">Usable frequency spectrum is </w:t>
-      </w:r>
-      <w:proofErr w:type="gramStart"/>
-      <w:r>
-        <w:rPr>
-          <w:color w:val="FF0000"/>
-        </w:rPr>
-        <w:t>small</w:t>
-      </w:r>
-      <w:proofErr w:type="gramEnd"/>
+        <w:t>Usable frequency spectrum is small</w:t>
+      </w:r>
     </w:p>
     <w:p>
       <w:pPr>
@@ -1247,19 +1148,7 @@
         <w:rPr>
           <w:color w:val="FF0000"/>
         </w:rPr>
-        <w:t>High su</w:t>
-      </w:r>
-      <w:r>
-        <w:rPr>
-          <w:color w:val="FF0000"/>
-        </w:rPr>
-        <w:t>s</w:t>
-      </w:r>
-      <w:r>
-        <w:rPr>
-          <w:color w:val="FF0000"/>
-        </w:rPr>
-        <w:t>ceptibility to electromagnetic and radio frequency interference</w:t>
+        <w:t>High susceptibility to electromagnetic and radio frequency interference</w:t>
       </w:r>
     </w:p>
     <w:p>
@@ -1484,16 +1373,8 @@
         <w:rPr>
           <w:color w:val="FF0000"/>
         </w:rPr>
-        <w:t xml:space="preserve">lectric and magnetic fields are confined to the dielectric with little leakage outside the </w:t>
-      </w:r>
-      <w:proofErr w:type="gramStart"/>
-      <w:r>
-        <w:rPr>
-          <w:color w:val="FF0000"/>
-        </w:rPr>
-        <w:t>shield</w:t>
-      </w:r>
-      <w:proofErr w:type="gramEnd"/>
+        <w:t>lectric and magnetic fields are confined to the dielectric with little leakage outside the shield</w:t>
+      </w:r>
     </w:p>
     <w:p>
       <w:pPr>
@@ -1672,16 +1553,8 @@
         <w:rPr>
           <w:color w:val="FF0000"/>
         </w:rPr>
-        <w:t xml:space="preserve">Has a minimum radius for </w:t>
-      </w:r>
-      <w:proofErr w:type="gramStart"/>
-      <w:r>
-        <w:rPr>
-          <w:color w:val="FF0000"/>
-        </w:rPr>
-        <w:t>bending</w:t>
-      </w:r>
-      <w:proofErr w:type="gramEnd"/>
+        <w:t>Has a minimum radius for bending</w:t>
+      </w:r>
     </w:p>
     <w:p>
       <w:pPr>
@@ -1704,16 +1577,8 @@
         <w:rPr>
           <w:color w:val="FF0000"/>
         </w:rPr>
-        <w:t xml:space="preserve">low bending to maintain total internal reflection for </w:t>
-      </w:r>
-      <w:proofErr w:type="gramStart"/>
-      <w:r>
-        <w:rPr>
-          <w:color w:val="FF0000"/>
-        </w:rPr>
-        <w:t>transmission</w:t>
-      </w:r>
-      <w:proofErr w:type="gramEnd"/>
+        <w:t>low bending to maintain total internal reflection for transmission</w:t>
+      </w:r>
     </w:p>
     <w:p>
       <w:pPr>
@@ -1744,16 +1609,8 @@
         <w:rPr>
           <w:color w:val="FF0000"/>
         </w:rPr>
-        <w:t xml:space="preserve"> is </w:t>
-      </w:r>
-      <w:proofErr w:type="gramStart"/>
-      <w:r>
-        <w:rPr>
-          <w:color w:val="FF0000"/>
-        </w:rPr>
-        <w:t>one-way</w:t>
-      </w:r>
-      <w:proofErr w:type="gramEnd"/>
+        <w:t xml:space="preserve"> is one-way</w:t>
+      </w:r>
     </w:p>
     <w:p>
       <w:pPr>
@@ -1842,16 +1699,8 @@
         <w:rPr>
           <w:color w:val="FF0000"/>
         </w:rPr>
-        <w:t xml:space="preserve">between fibre and cable </w:t>
-      </w:r>
-      <w:proofErr w:type="gramStart"/>
-      <w:r>
-        <w:rPr>
-          <w:color w:val="FF0000"/>
-        </w:rPr>
-        <w:t>circuits</w:t>
-      </w:r>
-      <w:proofErr w:type="gramEnd"/>
+        <w:t>between fibre and cable circuits</w:t>
+      </w:r>
     </w:p>
     <w:p>
       <w:pPr>
@@ -1868,16 +1717,8 @@
         <w:rPr>
           <w:color w:val="FF0000"/>
         </w:rPr>
-        <w:t xml:space="preserve">Labour resources to install fibre and </w:t>
-      </w:r>
-      <w:proofErr w:type="gramStart"/>
-      <w:r>
-        <w:rPr>
-          <w:color w:val="FF0000"/>
-        </w:rPr>
-        <w:t>interfaces</w:t>
-      </w:r>
-      <w:proofErr w:type="gramEnd"/>
+        <w:t>Labour resources to install fibre and interfaces</w:t>
+      </w:r>
     </w:p>
     <w:p>
       <w:pPr>
@@ -2101,7 +1942,21 @@
         <w:rPr>
           <w:color w:val="FF0000"/>
         </w:rPr>
-        <w:t xml:space="preserve"> packet systems allow a number of sessions to occupy the transmission media</w:t>
+        <w:t xml:space="preserve"> packet systems allow </w:t>
+      </w:r>
+      <w:proofErr w:type="gramStart"/>
+      <w:r>
+        <w:rPr>
+          <w:color w:val="FF0000"/>
+        </w:rPr>
+        <w:t>a number of</w:t>
+      </w:r>
+      <w:proofErr w:type="gramEnd"/>
+      <w:r>
+        <w:rPr>
+          <w:color w:val="FF0000"/>
+        </w:rPr>
+        <w:t xml:space="preserve"> sessions to occupy the transmission media</w:t>
       </w:r>
       <w:r>
         <w:rPr>
@@ -2343,7 +2198,7 @@
 </file>
 
 <file path=word/numbering.xml><?xml version="1.0" encoding="utf-8"?>
-<w:numbering xmlns:wpc="http://schemas.microsoft.com/office/word/2010/wordprocessingCanvas" xmlns:cx="http://schemas.microsoft.com/office/drawing/2014/chartex" xmlns:cx1="http://schemas.microsoft.com/office/drawing/2015/9/8/chartex" xmlns:cx2="http://schemas.microsoft.com/office/drawing/2015/10/21/chartex" xmlns:cx3="http://schemas.microsoft.com/office/drawing/2016/5/9/chartex" xmlns:cx4="http://schemas.microsoft.com/office/drawing/2016/5/10/chartex" xmlns:cx5="http://schemas.microsoft.com/office/drawing/2016/5/11/chartex" xmlns:cx6="http://schemas.microsoft.com/office/drawing/2016/5/12/chartex" xmlns:cx7="http://schemas.microsoft.com/office/drawing/2016/5/13/chartex" xmlns:cx8="http://schemas.microsoft.com/office/drawing/2016/5/14/chartex" xmlns:mc="http://schemas.openxmlformats.org/markup-compatibility/2006" xmlns:aink="http://schemas.microsoft.com/office/drawing/2016/ink" xmlns:am3d="http://schemas.microsoft.com/office/drawing/2017/model3d" xmlns:o="urn:schemas-microsoft-com:office:office" xmlns:oel="http://schemas.microsoft.com/office/2019/extlst" xmlns:r="http://schemas.openxmlformats.org/officeDocument/2006/relationships" xmlns:m="http://schemas.openxmlformats.org/officeDocument/2006/math" xmlns:v="urn:schemas-microsoft-com:vml" xmlns:wp14="http://schemas.microsoft.com/office/word/2010/wordprocessingDrawing" xmlns:wp="http://schemas.openxmlformats.org/drawingml/2006/wordprocessingDrawing" xmlns:w10="urn:schemas-microsoft-com:office:word" xmlns:w="http://schemas.openxmlformats.org/wordprocessingml/2006/main" xmlns:w14="http://schemas.microsoft.com/office/word/2010/wordml" xmlns:w15="http://schemas.microsoft.com/office/word/2012/wordml" xmlns:w16cex="http://schemas.microsoft.com/office/word/2018/wordml/cex" xmlns:w16cid="http://schemas.microsoft.com/office/word/2016/wordml/cid" xmlns:w16="http://schemas.microsoft.com/office/word/2018/wordml" xmlns:w16du="http://schemas.microsoft.com/office/word/2023/wordml/word16du" xmlns:w16sdtdh="http://schemas.microsoft.com/office/word/2020/wordml/sdtdatahash" xmlns:w16se="http://schemas.microsoft.com/office/word/2015/wordml/symex" xmlns:wpg="http://schemas.microsoft.com/office/word/2010/wordprocessingGroup" xmlns:wpi="http://schemas.microsoft.com/office/word/2010/wordprocessingInk" xmlns:wne="http://schemas.microsoft.com/office/word/2006/wordml" xmlns:wps="http://schemas.microsoft.com/office/word/2010/wordprocessingShape" mc:Ignorable="w14 w15 w16se w16cid w16 w16cex w16sdtdh wp14">
+<w:numbering xmlns:wpc="http://schemas.microsoft.com/office/word/2010/wordprocessingCanvas" xmlns:cx="http://schemas.microsoft.com/office/drawing/2014/chartex" xmlns:cx1="http://schemas.microsoft.com/office/drawing/2015/9/8/chartex" xmlns:cx2="http://schemas.microsoft.com/office/drawing/2015/10/21/chartex" xmlns:cx3="http://schemas.microsoft.com/office/drawing/2016/5/9/chartex" xmlns:cx4="http://schemas.microsoft.com/office/drawing/2016/5/10/chartex" xmlns:cx5="http://schemas.microsoft.com/office/drawing/2016/5/11/chartex" xmlns:cx6="http://schemas.microsoft.com/office/drawing/2016/5/12/chartex" xmlns:cx7="http://schemas.microsoft.com/office/drawing/2016/5/13/chartex" xmlns:cx8="http://schemas.microsoft.com/office/drawing/2016/5/14/chartex" xmlns:mc="http://schemas.openxmlformats.org/markup-compatibility/2006" xmlns:aink="http://schemas.microsoft.com/office/drawing/2016/ink" xmlns:am3d="http://schemas.microsoft.com/office/drawing/2017/model3d" xmlns:o="urn:schemas-microsoft-com:office:office" xmlns:oel="http://schemas.microsoft.com/office/2019/extlst" xmlns:r="http://schemas.openxmlformats.org/officeDocument/2006/relationships" xmlns:m="http://schemas.openxmlformats.org/officeDocument/2006/math" xmlns:v="urn:schemas-microsoft-com:vml" xmlns:wp14="http://schemas.microsoft.com/office/word/2010/wordprocessingDrawing" xmlns:wp="http://schemas.openxmlformats.org/drawingml/2006/wordprocessingDrawing" xmlns:w10="urn:schemas-microsoft-com:office:word" xmlns:w="http://schemas.openxmlformats.org/wordprocessingml/2006/main" xmlns:w14="http://schemas.microsoft.com/office/word/2010/wordml" xmlns:w15="http://schemas.microsoft.com/office/word/2012/wordml" xmlns:w16cex="http://schemas.microsoft.com/office/word/2018/wordml/cex" xmlns:w16cid="http://schemas.microsoft.com/office/word/2016/wordml/cid" xmlns:w16="http://schemas.microsoft.com/office/word/2018/wordml" xmlns:w16du="http://schemas.microsoft.com/office/word/2023/wordml/word16du" xmlns:w16sdtdh="http://schemas.microsoft.com/office/word/2020/wordml/sdtdatahash" xmlns:w16sdtfl="http://schemas.microsoft.com/office/word/2024/wordml/sdtformatlock" xmlns:w16se="http://schemas.microsoft.com/office/word/2015/wordml/symex" xmlns:wpg="http://schemas.microsoft.com/office/word/2010/wordprocessingGroup" xmlns:wpi="http://schemas.microsoft.com/office/word/2010/wordprocessingInk" xmlns:wne="http://schemas.microsoft.com/office/word/2006/wordml" xmlns:wps="http://schemas.microsoft.com/office/word/2010/wordprocessingShape" mc:Ignorable="w14 w15 w16se w16cid w16 w16cex w16sdtdh w16sdtfl w16du wp14">
   <w:abstractNum w:abstractNumId="0" w15:restartNumberingAfterBreak="0">
     <w:nsid w:val="16323158"/>
     <w:multiLevelType w:val="hybridMultilevel"/>
@@ -3160,7 +3015,7 @@
 </file>
 
 <file path=word/styles.xml><?xml version="1.0" encoding="utf-8"?>
-<w:styles xmlns:mc="http://schemas.openxmlformats.org/markup-compatibility/2006" xmlns:r="http://schemas.openxmlformats.org/officeDocument/2006/relationships" xmlns:w="http://schemas.openxmlformats.org/wordprocessingml/2006/main" xmlns:w14="http://schemas.microsoft.com/office/word/2010/wordml" xmlns:w15="http://schemas.microsoft.com/office/word/2012/wordml" xmlns:w16cex="http://schemas.microsoft.com/office/word/2018/wordml/cex" xmlns:w16cid="http://schemas.microsoft.com/office/word/2016/wordml/cid" xmlns:w16="http://schemas.microsoft.com/office/word/2018/wordml" xmlns:w16sdtdh="http://schemas.microsoft.com/office/word/2020/wordml/sdtdatahash" xmlns:w16se="http://schemas.microsoft.com/office/word/2015/wordml/symex" mc:Ignorable="w14 w15 w16se w16cid w16 w16cex w16sdtdh">
+<w:styles xmlns:mc="http://schemas.openxmlformats.org/markup-compatibility/2006" xmlns:r="http://schemas.openxmlformats.org/officeDocument/2006/relationships" xmlns:w="http://schemas.openxmlformats.org/wordprocessingml/2006/main" xmlns:w14="http://schemas.microsoft.com/office/word/2010/wordml" xmlns:w15="http://schemas.microsoft.com/office/word/2012/wordml" xmlns:w16cex="http://schemas.microsoft.com/office/word/2018/wordml/cex" xmlns:w16cid="http://schemas.microsoft.com/office/word/2016/wordml/cid" xmlns:w16="http://schemas.microsoft.com/office/word/2018/wordml" xmlns:w16du="http://schemas.microsoft.com/office/word/2023/wordml/word16du" xmlns:w16sdtdh="http://schemas.microsoft.com/office/word/2020/wordml/sdtdatahash" xmlns:w16sdtfl="http://schemas.microsoft.com/office/word/2024/wordml/sdtformatlock" xmlns:w16se="http://schemas.microsoft.com/office/word/2015/wordml/symex" mc:Ignorable="w14 w15 w16se w16cid w16 w16cex w16sdtdh w16sdtfl w16du">
   <w:docDefaults>
     <w:rPrDefault>
       <w:rPr>
@@ -3689,6 +3544,7 @@
   <w:style w:type="character" w:default="1" w:styleId="DefaultParagraphFont">
     <w:name w:val="Default Paragraph Font"/>
     <w:uiPriority w:val="1"/>
+    <w:semiHidden/>
     <w:unhideWhenUsed/>
   </w:style>
   <w:style w:type="table" w:default="1" w:styleId="TableNormal">

</xml_diff>